<commit_message>
chore(assets): update modified CV and document files
- assets/cv-ats.pdf (updated)
- assets/cv-ats.docx (updated)
- assets/cv-reclutador.pdf (updated)
- assets/no_aplica/cv-reclutador.docx (updated)
</commit_message>
<xml_diff>
--- a/assets/cv-ats.docx
+++ b/assets/cv-ats.docx
@@ -3,9 +3,6 @@
 <w:document xmlns:wpc="http://schemas.microsoft.com/office/word/2010/wordprocessingCanvas" xmlns:mo="http://schemas.microsoft.com/office/mac/office/2008/main" xmlns:mc="http://schemas.openxmlformats.org/markup-compatibility/2006" xmlns:mv="urn:schemas-microsoft-com:mac:vml" xmlns:o="urn:schemas-microsoft-com:office:office" xmlns:r="http://schemas.openxmlformats.org/officeDocument/2006/relationships" xmlns:m="http://schemas.openxmlformats.org/officeDocument/2006/math" xmlns:v="urn:schemas-microsoft-com:vml" xmlns:wp14="http://schemas.microsoft.com/office/word/2010/wordprocessingDrawing" xmlns:wp="http://schemas.openxmlformats.org/drawingml/2006/wordprocessingDrawing" xmlns:w10="urn:schemas-microsoft-com:office:word" xmlns:w="http://schemas.openxmlformats.org/wordprocessingml/2006/main" xmlns:w14="http://schemas.microsoft.com/office/word/2010/wordml" xmlns:wpg="http://schemas.microsoft.com/office/word/2010/wordprocessingGroup" xmlns:wpi="http://schemas.microsoft.com/office/word/2010/wordprocessingInk" xmlns:wne="http://schemas.microsoft.com/office/word/2006/wordml" xmlns:wps="http://schemas.microsoft.com/office/word/2010/wordprocessingShape" mc:Ignorable="w14 wp14">
   <w:body>
     <w:p>
-      <w:pPr>
-        <w:jc w:val="left"/>
-      </w:pPr>
       <w:r>
         <w:rPr>
           <w:b/>
@@ -16,90 +13,62 @@
     </w:p>
     <w:p>
       <w:r>
-        <w:rPr>
-          <w:b/>
-          <w:sz w:val="24"/>
-        </w:rPr>
-        <w:t>Arquitecto de Software / Desarrollador Full Stack Senior</w:t>
+        <w:t>Arquitecto de Software | Full‑Stack Senior (PHP/JS/SQL) | Modernización &amp; DevOps</w:t>
       </w:r>
     </w:p>
     <w:p>
-      <w:pPr>
-        <w:spacing w:after="200"/>
-      </w:pPr>
       <w:r>
-        <w:t>Santiago, Chile | +56 9 8121 8838 | vladimir.acuna.dev@gmail.com | Web: https://vladimiracunadev-create.github.io/ | GitHub: https://github.com/vladimiracunadev-create | LinkedIn: https://www.linkedin.com/in/vladimir-acu%C3%B1a-valdebenito-11924a29/</w:t>
+        <w:t>Santiago, Chile | +56 9 8121 8838 | vladimir.acuna.dev@gmail.com | Web: https://vladimiracunadev-create.github.io/ | GitHub: https://github.com/vladimiracunadev-create | LinkedIn: https://www.linkedin.com/in/vladimir-acuna-valdebenito</w:t>
       </w:r>
     </w:p>
+    <w:p/>
     <w:p>
-      <w:pPr>
-        <w:spacing w:before="120" w:after="40"/>
-      </w:pPr>
       <w:r>
         <w:rPr>
           <w:b/>
-          <w:sz w:val="23"/>
         </w:rPr>
         <w:t>RESUMEN</w:t>
       </w:r>
     </w:p>
     <w:p>
+      <w:pPr>
+        <w:pStyle w:val="ListBullet"/>
+      </w:pPr>
       <w:r>
-        <w:t>Arquitecto de Software y Full Stack Senior con 14 años liderando el análisis, desarrollo y mantención de una plataforma web educativa/psicométrica de alto impacto (2011–2025). Experiencia en modernización progresiva (PHP 5.4 → PHP 8.2), optimización de rendimiento (JavaScript), generación de reportes PDF/Excel (indicadores, percentiles) y migraciones/importaciones masivas desde Excel con validaciones. Foco en confiabilidad operacional, documentación y entrega de soluciones usables para usuarios no técnicos. En etapa reciente: consolidación de portafolio open-source con laboratorios Docker/CI/CD y prototipos de agentes (LangGraph/MCP) en entorno local.</w:t>
+        <w:t>14 años liderando el diseño, evolución y operación de una plataforma educativa/psicométrica (2011–2025), con foco en continuidad operacional.</w:t>
       </w:r>
     </w:p>
     <w:p>
       <w:pPr>
-        <w:spacing w:before="120" w:after="40"/>
+        <w:pStyle w:val="ListBullet"/>
       </w:pPr>
       <w:r>
-        <w:rPr>
-          <w:b/>
-          <w:sz w:val="23"/>
-        </w:rPr>
-        <w:t>COMPETENCIAS TÉCNICAS</w:t>
-      </w:r>
-    </w:p>
-    <w:p>
-      <w:r>
-        <w:t>Backend: PHP 8.x/5.x, Python (FastAPI), Node.js (básico), APIs REST.</w:t>
-      </w:r>
-    </w:p>
-    <w:p>
-      <w:r>
-        <w:t>Frontend: JavaScript, HTML, CSS, jQuery.</w:t>
-      </w:r>
-    </w:p>
-    <w:p>
-      <w:r>
-        <w:t>Datos: SQL Server, MySQL/MariaDB, modelado, procedimientos/consultas, importación desde Excel.</w:t>
-      </w:r>
-    </w:p>
-    <w:p>
-      <w:r>
-        <w:t>Reportes y automatización: PDF/Excel (FPDF/PhpSpreadsheet), envíos masivos (SMTP, MasterBase, ConstantContact).</w:t>
-      </w:r>
-    </w:p>
-    <w:p>
-      <w:r>
-        <w:t>DevOps: Linux (CentOS/RedHat), Apache, Docker/Compose (proyectos recientes), CI/CD (proyectos recientes).</w:t>
-      </w:r>
-    </w:p>
-    <w:p>
-      <w:r>
-        <w:t>Calidad/operación: pruebas de carga (Apache JMeter), soporte de producción, troubleshooting.</w:t>
+        <w:t>Modernización progresiva (PHP 5.4 → PHP 8.2+), optimización de rendimiento y automatización de reportes (PDF/Excel) y procesos de datos.</w:t>
       </w:r>
     </w:p>
     <w:p>
       <w:pPr>
-        <w:spacing w:before="120" w:after="40"/>
+        <w:pStyle w:val="ListBullet"/>
       </w:pPr>
+      <w:r>
+        <w:t>Experiencia en bases de datos (SQL Server, MySQL/MariaDB) y despliegues/entornos reproducibles con Docker y CI/CD.</w:t>
+      </w:r>
+    </w:p>
+    <w:p>
+      <w:pPr>
+        <w:pStyle w:val="ListBullet"/>
+      </w:pPr>
+      <w:r>
+        <w:t>Portafolio técnico con casos prácticos (Cloud/AWS, microsistemas y agentes), documentación y demos verificables.</w:t>
+      </w:r>
+    </w:p>
+    <w:p/>
+    <w:p>
       <w:r>
         <w:rPr>
           <w:b/>
-          <w:sz w:val="23"/>
         </w:rPr>
-        <w:t>EXPERIENCIA (SELECCIÓN)</w:t>
+        <w:t>SKILLS</w:t>
       </w:r>
     </w:p>
     <w:p>
@@ -107,7 +76,82 @@
         <w:rPr>
           <w:b/>
         </w:rPr>
-        <w:t>Fundación CEIS Maristas — Arquitecto de Software y Desarrollador Full Stack | 2011–2025</w:t>
+        <w:t xml:space="preserve">Backend: </w:t>
+      </w:r>
+      <w:r>
+        <w:t>PHP 8.x, Node.js, TypeScript, Python (FastAPI)</w:t>
+      </w:r>
+    </w:p>
+    <w:p>
+      <w:r>
+        <w:rPr>
+          <w:b/>
+        </w:rPr>
+        <w:t xml:space="preserve">Frontend: </w:t>
+      </w:r>
+      <w:r>
+        <w:t>JavaScript, HTML, CSS</w:t>
+      </w:r>
+    </w:p>
+    <w:p>
+      <w:r>
+        <w:rPr>
+          <w:b/>
+        </w:rPr>
+        <w:t xml:space="preserve">Datos: </w:t>
+      </w:r>
+      <w:r>
+        <w:t>SQL Server, MySQL/MariaDB, modelado, ETL desde Excel</w:t>
+      </w:r>
+    </w:p>
+    <w:p>
+      <w:r>
+        <w:rPr>
+          <w:b/>
+        </w:rPr>
+        <w:t xml:space="preserve">DevOps/Cloud: </w:t>
+      </w:r>
+      <w:r>
+        <w:t>Docker/Compose, CI/CD (GitHub Actions/GitLab CI), AWS (S3, Amplify, CloudFront), Terraform (básico)</w:t>
+      </w:r>
+    </w:p>
+    <w:p>
+      <w:r>
+        <w:rPr>
+          <w:b/>
+        </w:rPr>
+        <w:t xml:space="preserve">Calidad/Seguridad: </w:t>
+      </w:r>
+      <w:r>
+        <w:t>hardening básico, secret scanning, control anti‑inyección</w:t>
+      </w:r>
+    </w:p>
+    <w:p>
+      <w:r>
+        <w:rPr>
+          <w:b/>
+        </w:rPr>
+        <w:t xml:space="preserve">Observabilidad: </w:t>
+      </w:r>
+      <w:r>
+        <w:t>Prometheus/Grafana (laboratorios y fundamentos)</w:t>
+      </w:r>
+    </w:p>
+    <w:p/>
+    <w:p>
+      <w:r>
+        <w:rPr>
+          <w:b/>
+        </w:rPr>
+        <w:t>EXPERIENCIA</w:t>
+      </w:r>
+    </w:p>
+    <w:p>
+      <w:r>
+        <w:rPr>
+          <w:b/>
+        </w:rPr>
+        <w:t>Fundación CEIS Maristas — Arquitecto de Software y Desarrollador Full‑Stack (2011–2025)</w:t>
       </w:r>
     </w:p>
     <w:p>
@@ -115,7 +159,7 @@
         <w:pStyle w:val="ListBullet"/>
       </w:pPr>
       <w:r>
-        <w:t>Diseño, desarrollo y mantención de plataforma web de evaluación de alumnos (múltiples baterías de test), reportes y módulos de gestión institucional.</w:t>
+        <w:t>Diseño, desarrollo y mantención de plataforma de evaluación de alumnos (baterías de test), módulos institucionales y reportes.</w:t>
       </w:r>
     </w:p>
     <w:p>
@@ -123,7 +167,7 @@
         <w:pStyle w:val="ListBullet"/>
       </w:pPr>
       <w:r>
-        <w:t>Modernización progresiva: migración de PHP 5.4 a PHP 8.2, actualización de servidores/librerías y mejoras de rendimiento moviendo tareas al frontend (JavaScript).</w:t>
+        <w:t>Migración tecnológica (PHP 5.4 → PHP 8.2+), actualización de servidores/librerías y mejoras de rendimiento con JavaScript y pruebas de carga.</w:t>
       </w:r>
     </w:p>
     <w:p>
@@ -131,7 +175,7 @@
         <w:pStyle w:val="ListBullet"/>
       </w:pPr>
       <w:r>
-        <w:t>Desarrollo de reportes avanzados en PDF y Excel con indicadores y percentiles; análisis por curso, nivel y establecimiento.</w:t>
+        <w:t>Desarrollo de reportes avanzados PDF/Excel con indicadores, percentiles y análisis por curso/nivel/establecimiento.</w:t>
       </w:r>
     </w:p>
     <w:p>
@@ -139,7 +183,7 @@
         <w:pStyle w:val="ListBullet"/>
       </w:pPr>
       <w:r>
-        <w:t>Importación y migración de datos masivos desde Excel con validaciones; automatización de comunicaciones (envíos masivos, segmentación, seguimiento).</w:t>
+        <w:t>Importación y migración de datos masivos desde Excel con validaciones; automatización de comunicaciones (envíos, segmentación, seguimiento).</w:t>
       </w:r>
     </w:p>
     <w:p>
@@ -147,12 +191,7 @@
         <w:pStyle w:val="ListBullet"/>
       </w:pPr>
       <w:r>
-        <w:t>Soporte directo a usuarios clave (coordinadores, orientadores y directivos), con foco en estabilidad y tiempos de respuesta.</w:t>
-      </w:r>
-    </w:p>
-    <w:p>
-      <w:r>
-        <w:t>Stack principal: PHP, JavaScript, HTML/CSS, SQL Server, MySQL, Apache, JMeter, FPDF/PhpSpreadsheet, Excel.</w:t>
+        <w:t>Soporte directo a usuarios clave (coordinadores, orientadores, directivos) y operación en producción.</w:t>
       </w:r>
     </w:p>
     <w:p>
@@ -160,7 +199,19 @@
         <w:rPr>
           <w:b/>
         </w:rPr>
-        <w:t>Experiencia adicional — Asesor de Informática (CONACE/SENDA) | 2008–2010</w:t>
+        <w:t xml:space="preserve">Tecnologías: </w:t>
+      </w:r>
+      <w:r>
+        <w:t>PHP, JavaScript, SQL Server, MySQL, Apache, JMeter, Excel, FPDF/PhpSpreadsheet, Constant Contact</w:t>
+      </w:r>
+    </w:p>
+    <w:p/>
+    <w:p>
+      <w:r>
+        <w:rPr>
+          <w:b/>
+        </w:rPr>
+        <w:t>PROYECTOS DESTACADOS</w:t>
       </w:r>
     </w:p>
     <w:p>
@@ -168,7 +219,7 @@
         <w:pStyle w:val="ListBullet"/>
       </w:pPr>
       <w:r>
-        <w:t>Análisis, desarrollo y mantención de sistemas clave (RR.HH., adquisiciones/inventario y registro de sustancias controladas).</w:t>
+        <w:t>Cloud/AWS y FinOps (demos y documentación): https://github.com/vladimiracunadev-create/proyectos-aws</w:t>
       </w:r>
     </w:p>
     <w:p>
@@ -176,19 +227,7 @@
         <w:pStyle w:val="ListBullet"/>
       </w:pPr>
       <w:r>
-        <w:t>Implementación de formularios, reportes PDF/Excel/XML, flujos, importación desde Excel y controles básicos de seguridad (captcha, cifrado, control de accesos/inyección SQL).</w:t>
-      </w:r>
-    </w:p>
-    <w:p>
-      <w:pPr>
-        <w:spacing w:before="120" w:after="40"/>
-      </w:pPr>
-      <w:r>
-        <w:rPr>
-          <w:b/>
-          <w:sz w:val="23"/>
-        </w:rPr>
-        <w:t>PROYECTOS Y FORMACIÓN RECIENTE (2023–2026)</w:t>
+        <w:t>Microsistemas (suite modular y documentación): https://github.com/vladimiracunadev-create/microsistemas</w:t>
       </w:r>
     </w:p>
     <w:p>
@@ -196,7 +235,7 @@
         <w:pStyle w:val="ListBullet"/>
       </w:pPr>
       <w:r>
-        <w:t>Portafolio y demos: sitio personal y repositorios con casos reproducibles. Web: https://vladimiracunadev-create.github.io/</w:t>
+        <w:t>LangGraph casos reales (agentes con estado): https://github.com/vladimiracunadev-create/langgraph-realworld</w:t>
       </w:r>
     </w:p>
     <w:p>
@@ -204,7 +243,16 @@
         <w:pStyle w:val="ListBullet"/>
       </w:pPr>
       <w:r>
-        <w:t>Demos AWS (Amplify) y despliegue de contenido técnico: https://main.d3r1wuymolxagh.amplifyapp.com/</w:t>
+        <w:t>MCP + Ollama local (tooling y PoC): https://github.com/vladimiracunadev-create/mcp-ollama-local</w:t>
+      </w:r>
+    </w:p>
+    <w:p/>
+    <w:p>
+      <w:r>
+        <w:rPr>
+          <w:b/>
+        </w:rPr>
+        <w:t>FORMACIÓN Y ACTIVIDAD RECIENTE</w:t>
       </w:r>
     </w:p>
     <w:p>
@@ -212,7 +260,7 @@
         <w:pStyle w:val="ListBullet"/>
       </w:pPr>
       <w:r>
-        <w:t>Agentes y tooling (proyectos personales): LangGraph/MCP + ejecución local con Ollama (PoCs).</w:t>
+        <w:t>Formación continua (cursos online): bases de ML/NLP y automatización práctica aplicada a proyectos.</w:t>
       </w:r>
     </w:p>
     <w:p>
@@ -220,7 +268,51 @@
         <w:pStyle w:val="ListBullet"/>
       </w:pPr>
       <w:r>
-        <w:t>Udemy (2023): Machine Learning y NLP con Python/TensorFlow (40+ hrs, con certificado).</w:t>
+        <w:t>Consolidación de portafolio técnico (Cloud/AWS, Docker labs, agentes) y documentación orientada a reclutadores.</w:t>
+      </w:r>
+    </w:p>
+    <w:p/>
+    <w:p>
+      <w:r>
+        <w:rPr>
+          <w:b/>
+        </w:rPr>
+        <w:t>EDUCACIÓN</w:t>
+      </w:r>
+    </w:p>
+    <w:p>
+      <w:r>
+        <w:rPr>
+          <w:b/>
+        </w:rPr>
+        <w:t>Ingeniería de Ejecución en Computación e Informática</w:t>
+      </w:r>
+    </w:p>
+    <w:p>
+      <w:r>
+        <w:t>Universidad de Tarapacá (Arica)</w:t>
+      </w:r>
+    </w:p>
+    <w:p>
+      <w:r>
+        <w:rPr>
+          <w:b/>
+        </w:rPr>
+        <w:t>Técnico de Administración de Empresas (Mención Marketing)</w:t>
+      </w:r>
+    </w:p>
+    <w:p>
+      <w:r>
+        <w:t>INACAP (Santiago)</w:t>
+      </w:r>
+    </w:p>
+    <w:p/>
+    <w:p>
+      <w:r>
+        <w:rPr>
+          <w:b/>
+        </w:rPr>
+        <w:t>IDIOMAS</w:t>
       </w:r>
     </w:p>
     <w:p>
@@ -228,64 +320,12 @@
         <w:pStyle w:val="ListBullet"/>
       </w:pPr>
       <w:r>
-        <w:t>Desafío Latam (2019): Taller de ciberseguridad (3 hrs).</w:t>
-      </w:r>
-    </w:p>
-    <w:p>
-      <w:r>
-        <w:t>Video (Elevator Pitch): https://youtu.be/huIjsH-N7to</w:t>
-      </w:r>
-    </w:p>
-    <w:p>
-      <w:pPr>
-        <w:spacing w:before="120" w:after="40"/>
-      </w:pPr>
-      <w:r>
-        <w:rPr>
-          <w:b/>
-          <w:sz w:val="23"/>
-        </w:rPr>
-        <w:t>EDUCACIÓN</w:t>
-      </w:r>
-    </w:p>
-    <w:p>
-      <w:r>
-        <w:t>Ingeniería de Ejecución en Computación e Informática — Universidad de Tarapacá (Titulado).</w:t>
-      </w:r>
-    </w:p>
-    <w:p>
-      <w:r>
-        <w:t>Técnico en Administración de Empresas, mención Marketing (certificación SAP Usuario) — INACAP.</w:t>
-      </w:r>
-    </w:p>
-    <w:p>
-      <w:pPr>
-        <w:spacing w:before="120" w:after="40"/>
-      </w:pPr>
-      <w:r>
-        <w:rPr>
-          <w:b/>
-          <w:sz w:val="23"/>
-        </w:rPr>
-        <w:t>IDIOMAS</w:t>
-      </w:r>
-    </w:p>
-    <w:p>
-      <w:r>
-        <w:t>Español: nativo. Inglés: lectura intermedia; escritura y conversación básicas.</w:t>
-      </w:r>
-    </w:p>
-    <w:p>
-      <w:r>
-        <w:rPr>
-          <w:i/>
-        </w:rPr>
-        <w:t>Formato ATS: documento de 1 columna, sin tablas ni gráficos.</w:t>
+        <w:t>Inglés: intermedio en lectura; básico en escritura y conversación.</w:t>
       </w:r>
     </w:p>
     <w:sectPr>
       <w:pgSz w:w="12240" w:h="15840"/>
-      <w:pgMar w:top="1008" w:right="1008" w:bottom="1008" w:left="1008" w:header="720" w:footer="720" w:gutter="0"/>
+      <w:pgMar w:top="907" w:right="964" w:bottom="907" w:left="964" w:header="720" w:footer="720" w:gutter="0"/>
       <w:cols w:space="720"/>
       <w:docGrid w:linePitch="360"/>
     </w:sectPr>

</xml_diff>